<commit_message>
Modified the code and project structure on answers and task 001: Initial running
</commit_message>
<xml_diff>
--- a/3.1/Distrubuted_Systems/lab_1/answers/answers.docx
+++ b/3.1/Distrubuted_Systems/lab_1/answers/answers.docx
@@ -27,9 +27,9 @@
         </w:tblCellMar>
       </w:tblPr>
       <w:tblGrid>
-        <w:gridCol w:w="1829"/>
+        <w:gridCol w:w="1828"/>
         <w:gridCol w:w="5396"/>
-        <w:gridCol w:w="2747"/>
+        <w:gridCol w:w="2748"/>
       </w:tblGrid>
       <w:tr>
         <w:trPr>
@@ -37,7 +37,7 @@
         </w:trPr>
         <w:tc>
           <w:tcPr>
-            <w:tcW w:w="1829" w:type="dxa"/>
+            <w:tcW w:w="1828" w:type="dxa"/>
             <w:tcBorders/>
             <w:vAlign w:val="center"/>
           </w:tcPr>
@@ -77,7 +77,7 @@
         </w:tc>
         <w:tc>
           <w:tcPr>
-            <w:tcW w:w="2747" w:type="dxa"/>
+            <w:tcW w:w="2748" w:type="dxa"/>
             <w:tcBorders/>
             <w:vAlign w:val="center"/>
           </w:tcPr>
@@ -100,7 +100,7 @@
         <w:trPr/>
         <w:tc>
           <w:tcPr>
-            <w:tcW w:w="1829" w:type="dxa"/>
+            <w:tcW w:w="1828" w:type="dxa"/>
             <w:tcBorders/>
             <w:vAlign w:val="center"/>
           </w:tcPr>
@@ -142,7 +142,7 @@
         </w:tc>
         <w:tc>
           <w:tcPr>
-            <w:tcW w:w="2747" w:type="dxa"/>
+            <w:tcW w:w="2748" w:type="dxa"/>
             <w:tcBorders/>
             <w:vAlign w:val="center"/>
           </w:tcPr>
@@ -166,7 +166,7 @@
         <w:trPr/>
         <w:tc>
           <w:tcPr>
-            <w:tcW w:w="1829" w:type="dxa"/>
+            <w:tcW w:w="1828" w:type="dxa"/>
             <w:tcBorders/>
             <w:vAlign w:val="center"/>
           </w:tcPr>
@@ -208,7 +208,7 @@
         </w:tc>
         <w:tc>
           <w:tcPr>
-            <w:tcW w:w="2747" w:type="dxa"/>
+            <w:tcW w:w="2748" w:type="dxa"/>
             <w:tcBorders/>
             <w:vAlign w:val="center"/>
           </w:tcPr>
@@ -232,7 +232,7 @@
         <w:trPr/>
         <w:tc>
           <w:tcPr>
-            <w:tcW w:w="1829" w:type="dxa"/>
+            <w:tcW w:w="1828" w:type="dxa"/>
             <w:tcBorders/>
             <w:vAlign w:val="center"/>
           </w:tcPr>
@@ -274,7 +274,7 @@
         </w:tc>
         <w:tc>
           <w:tcPr>
-            <w:tcW w:w="2747" w:type="dxa"/>
+            <w:tcW w:w="2748" w:type="dxa"/>
             <w:tcBorders/>
             <w:vAlign w:val="center"/>
           </w:tcPr>
@@ -298,7 +298,7 @@
         <w:trPr/>
         <w:tc>
           <w:tcPr>
-            <w:tcW w:w="1829" w:type="dxa"/>
+            <w:tcW w:w="1828" w:type="dxa"/>
             <w:tcBorders/>
             <w:vAlign w:val="center"/>
           </w:tcPr>
@@ -340,7 +340,7 @@
         </w:tc>
         <w:tc>
           <w:tcPr>
-            <w:tcW w:w="2747" w:type="dxa"/>
+            <w:tcW w:w="2748" w:type="dxa"/>
             <w:tcBorders/>
             <w:vAlign w:val="center"/>
           </w:tcPr>
@@ -364,7 +364,7 @@
         <w:trPr/>
         <w:tc>
           <w:tcPr>
-            <w:tcW w:w="1829" w:type="dxa"/>
+            <w:tcW w:w="1828" w:type="dxa"/>
             <w:tcBorders/>
             <w:vAlign w:val="center"/>
           </w:tcPr>
@@ -416,7 +416,7 @@
         </w:tc>
         <w:tc>
           <w:tcPr>
-            <w:tcW w:w="2747" w:type="dxa"/>
+            <w:tcW w:w="2748" w:type="dxa"/>
             <w:tcBorders/>
             <w:vAlign w:val="center"/>
           </w:tcPr>
@@ -440,7 +440,7 @@
         <w:trPr/>
         <w:tc>
           <w:tcPr>
-            <w:tcW w:w="1829" w:type="dxa"/>
+            <w:tcW w:w="1828" w:type="dxa"/>
             <w:tcBorders/>
             <w:vAlign w:val="center"/>
           </w:tcPr>
@@ -482,7 +482,7 @@
         </w:tc>
         <w:tc>
           <w:tcPr>
-            <w:tcW w:w="2747" w:type="dxa"/>
+            <w:tcW w:w="2748" w:type="dxa"/>
             <w:tcBorders/>
             <w:vAlign w:val="center"/>
           </w:tcPr>
@@ -506,22 +506,21 @@
         <w:trPr/>
         <w:tc>
           <w:tcPr>
-            <w:tcW w:w="1829" w:type="dxa"/>
-            <w:tcBorders/>
-            <w:vAlign w:val="center"/>
-          </w:tcPr>
-          <w:p>
-            <w:pPr>
-              <w:pStyle w:val="TableContents"/>
-              <w:widowControl w:val="false"/>
-              <w:suppressLineNumbers/>
-              <w:bidi w:val="0"/>
-              <w:jc w:val="start"/>
-              <w:rPr/>
-            </w:pPr>
-            <w:r>
-              <w:rPr/>
-              <w:t>Basic Communication</w:t>
+            <w:tcW w:w="1828" w:type="dxa"/>
+            <w:tcBorders/>
+            <w:vAlign w:val="center"/>
+          </w:tcPr>
+          <w:p>
+            <w:pPr>
+              <w:pStyle w:val="TableContents"/>
+              <w:widowControl w:val="false"/>
+              <w:suppressLineNumbers/>
+              <w:bidi w:val="0"/>
+              <w:jc w:val="start"/>
+              <w:rPr/>
+            </w:pPr>
+            <w:r>
+              <w:rPr/>
             </w:r>
           </w:p>
         </w:tc>
@@ -542,28 +541,26 @@
             </w:pPr>
             <w:r>
               <w:rPr/>
-              <w:t>The server accepted a connection request and exchanged data successfully with the client.</w:t>
-            </w:r>
-          </w:p>
-        </w:tc>
-        <w:tc>
-          <w:tcPr>
-            <w:tcW w:w="2747" w:type="dxa"/>
-            <w:tcBorders/>
-            <w:vAlign w:val="center"/>
-          </w:tcPr>
-          <w:p>
-            <w:pPr>
-              <w:pStyle w:val="TableContents"/>
-              <w:widowControl w:val="false"/>
-              <w:suppressLineNumbers/>
-              <w:bidi w:val="0"/>
-              <w:jc w:val="start"/>
-              <w:rPr/>
-            </w:pPr>
-            <w:r>
-              <w:rPr/>
-              <w:t>The socket-based client-server model functioned as expected.</w:t>
+            </w:r>
+          </w:p>
+        </w:tc>
+        <w:tc>
+          <w:tcPr>
+            <w:tcW w:w="2748" w:type="dxa"/>
+            <w:tcBorders/>
+            <w:vAlign w:val="center"/>
+          </w:tcPr>
+          <w:p>
+            <w:pPr>
+              <w:pStyle w:val="TableContents"/>
+              <w:widowControl w:val="false"/>
+              <w:suppressLineNumbers/>
+              <w:bidi w:val="0"/>
+              <w:jc w:val="start"/>
+              <w:rPr/>
+            </w:pPr>
+            <w:r>
+              <w:rPr/>
             </w:r>
           </w:p>
         </w:tc>
@@ -609,6 +606,7 @@
       <w:pPr>
         <w:pStyle w:val="Heading2"/>
         <w:bidi w:val="0"/>
+        <w:spacing w:before="0" w:after="120"/>
         <w:jc w:val="start"/>
         <w:rPr/>
       </w:pPr>
@@ -839,6 +837,7 @@
       <w:pgNumType w:fmt="decimal"/>
       <w:formProt w:val="false"/>
       <w:textDirection w:val="lrTb"/>
+      <w:docGrid w:type="default" w:linePitch="100" w:charSpace="0"/>
     </w:sectPr>
   </w:body>
 </w:document>
@@ -858,7 +857,6 @@
     </w:rPrDefault>
     <w:pPrDefault>
       <w:pPr>
-        <w:widowControl/>
         <w:suppressAutoHyphens w:val="true"/>
       </w:pPr>
     </w:pPrDefault>
@@ -868,7 +866,10 @@
     <w:qFormat/>
     <w:pPr>
       <w:widowControl/>
+      <w:suppressAutoHyphens w:val="true"/>
       <w:bidi w:val="0"/>
+      <w:spacing w:before="0" w:after="0"/>
+      <w:jc w:val="start"/>
     </w:pPr>
     <w:rPr>
       <w:rFonts w:ascii="Liberation Serif" w:hAnsi="Liberation Serif" w:eastAsia="DejaVu Sans" w:cs="DejaVu Sans"/>

</xml_diff>